<commit_message>
Replace questionnaires accordion with table; collapse logo block; fix logo for white background.
</commit_message>
<xml_diff>
--- a/oprosniki-i-shkaly.docx
+++ b/oprosniki-i-shkaly.docx
@@ -3,35 +3,42 @@
 <w:document xmlns:wpc="http://schemas.microsoft.com/office/word/2010/wordprocessingCanvas" xmlns:mo="http://schemas.microsoft.com/office/mac/office/2008/main" xmlns:mc="http://schemas.openxmlformats.org/markup-compatibility/2006" xmlns:mv="urn:schemas-microsoft-com:mac:vml" xmlns:o="urn:schemas-microsoft-com:office:office" xmlns:r="http://schemas.openxmlformats.org/officeDocument/2006/relationships" xmlns:m="http://schemas.openxmlformats.org/officeDocument/2006/math" xmlns:v="urn:schemas-microsoft-com:vml" xmlns:wp14="http://schemas.microsoft.com/office/word/2010/wordprocessingDrawing" xmlns:wp="http://schemas.openxmlformats.org/drawingml/2006/wordprocessingDrawing" xmlns:w10="urn:schemas-microsoft-com:office:word" xmlns:w="http://schemas.openxmlformats.org/wordprocessingml/2006/main" xmlns:w14="http://schemas.microsoft.com/office/word/2010/wordml" xmlns:wpg="http://schemas.microsoft.com/office/word/2010/wordprocessingGroup" xmlns:wpi="http://schemas.microsoft.com/office/word/2010/wordprocessingInk" xmlns:wne="http://schemas.microsoft.com/office/word/2006/wordml" xmlns:wps="http://schemas.microsoft.com/office/word/2010/wordprocessingShape" mc:Ignorable="w14 wp14">
   <w:body>
     <w:p>
+      <w:pPr>
+        <w:jc w:val="left"/>
+      </w:pPr>
       <w:r>
         <w:rPr>
-          <w:rFonts w:ascii="Montserrat" w:hAnsi="Montserrat"/>
+          <w:rFonts w:ascii="Montserrat" w:hAnsi="Montserrat" w:eastAsia="Montserrat"/>
           <w:b/>
-          <w:sz w:val="28"/>
+          <w:sz w:val="32"/>
         </w:rPr>
         <w:t>Опросники и шкалы оценок · ЦЛП</w:t>
       </w:r>
     </w:p>
     <w:tbl>
       <w:tblPr>
+        <w:tblStyle w:val="TableGrid"/>
         <w:tblW w:type="auto" w:w="0"/>
+        <w:tblLayout w:type="fixed"/>
         <w:tblLook w:firstColumn="1" w:firstRow="1" w:lastColumn="0" w:lastRow="0" w:noHBand="0" w:noVBand="1" w:val="04A0"/>
       </w:tblPr>
       <w:tblGrid>
-        <w:gridCol w:w="2880"/>
-        <w:gridCol w:w="2880"/>
-        <w:gridCol w:w="2880"/>
+        <w:gridCol w:w="3408"/>
+        <w:gridCol w:w="3408"/>
+        <w:gridCol w:w="3408"/>
       </w:tblGrid>
       <w:tr>
         <w:tc>
           <w:tcPr>
-            <w:tcW w:type="dxa" w:w="2880"/>
+            <w:tcW w:type="dxa" w:w="3312"/>
           </w:tcPr>
           <w:p>
-            <w:r/>
+            <w:pPr>
+              <w:jc w:val="left"/>
+            </w:pPr>
             <w:r>
               <w:rPr>
-                <w:rFonts w:ascii="Montserrat" w:hAnsi="Montserrat"/>
+                <w:rFonts w:ascii="Montserrat" w:hAnsi="Montserrat" w:eastAsia="Montserrat"/>
                 <w:b/>
                 <w:color w:val="019BAB"/>
                 <w:sz w:val="22"/>
@@ -42,13 +49,15 @@
         </w:tc>
         <w:tc>
           <w:tcPr>
-            <w:tcW w:type="dxa" w:w="2880"/>
+            <w:tcW w:type="dxa" w:w="3312"/>
           </w:tcPr>
           <w:p>
-            <w:r/>
+            <w:pPr>
+              <w:jc w:val="left"/>
+            </w:pPr>
             <w:r>
               <w:rPr>
-                <w:rFonts w:ascii="Montserrat" w:hAnsi="Montserrat"/>
+                <w:rFonts w:ascii="Montserrat" w:hAnsi="Montserrat" w:eastAsia="Montserrat"/>
                 <w:b/>
                 <w:color w:val="019BAB"/>
                 <w:sz w:val="22"/>
@@ -59,13 +68,15 @@
         </w:tc>
         <w:tc>
           <w:tcPr>
-            <w:tcW w:type="dxa" w:w="2880"/>
+            <w:tcW w:type="dxa" w:w="3312"/>
           </w:tcPr>
           <w:p>
-            <w:r/>
+            <w:pPr>
+              <w:jc w:val="left"/>
+            </w:pPr>
             <w:r>
               <w:rPr>
-                <w:rFonts w:ascii="Montserrat" w:hAnsi="Montserrat"/>
+                <w:rFonts w:ascii="Montserrat" w:hAnsi="Montserrat" w:eastAsia="Montserrat"/>
                 <w:b/>
                 <w:color w:val="019BAB"/>
                 <w:sz w:val="22"/>
@@ -78,13 +89,15 @@
       <w:tr>
         <w:tc>
           <w:tcPr>
-            <w:tcW w:type="dxa" w:w="2880"/>
+            <w:tcW w:type="dxa" w:w="3408"/>
           </w:tcPr>
           <w:p>
-            <w:r/>
+            <w:pPr>
+              <w:jc w:val="left"/>
+            </w:pPr>
             <w:r>
               <w:rPr>
-                <w:rFonts w:ascii="Montserrat" w:hAnsi="Montserrat"/>
+                <w:rFonts w:ascii="Montserrat" w:hAnsi="Montserrat" w:eastAsia="Montserrat"/>
                 <w:b/>
                 <w:sz w:val="22"/>
               </w:rPr>
@@ -94,27 +107,34 @@
         </w:tc>
         <w:tc>
           <w:tcPr>
-            <w:tcW w:type="dxa" w:w="2880"/>
+            <w:tcW w:type="dxa" w:w="3408"/>
           </w:tcPr>
           <w:p>
-            <w:r/>
+            <w:pPr>
+              <w:jc w:val="left"/>
+            </w:pPr>
             <w:r>
               <w:rPr>
-                <w:rFonts w:ascii="Montserrat" w:hAnsi="Montserrat"/>
+                <w:rFonts w:ascii="Montserrat" w:hAnsi="Montserrat" w:eastAsia="Montserrat"/>
+                <w:b w:val="0"/>
                 <w:sz w:val="22"/>
               </w:rPr>
+              <w:t>—</w:t>
             </w:r>
           </w:p>
         </w:tc>
         <w:tc>
           <w:tcPr>
-            <w:tcW w:type="dxa" w:w="2880"/>
+            <w:tcW w:type="dxa" w:w="3408"/>
           </w:tcPr>
           <w:p>
-            <w:r/>
+            <w:pPr>
+              <w:jc w:val="left"/>
+            </w:pPr>
             <w:r>
               <w:rPr>
-                <w:rFonts w:ascii="Montserrat" w:hAnsi="Montserrat"/>
+                <w:rFonts w:ascii="Montserrat" w:hAnsi="Montserrat" w:eastAsia="Montserrat"/>
+                <w:b w:val="0"/>
                 <w:sz w:val="22"/>
               </w:rPr>
               <w:t>М. Николаева, О. Бояршинова</w:t>
@@ -125,13 +145,15 @@
       <w:tr>
         <w:tc>
           <w:tcPr>
-            <w:tcW w:type="dxa" w:w="2880"/>
+            <w:tcW w:type="dxa" w:w="3408"/>
           </w:tcPr>
           <w:p>
-            <w:r/>
+            <w:pPr>
+              <w:jc w:val="left"/>
+            </w:pPr>
             <w:r>
               <w:rPr>
-                <w:rFonts w:ascii="Montserrat" w:hAnsi="Montserrat"/>
+                <w:rFonts w:ascii="Montserrat" w:hAnsi="Montserrat" w:eastAsia="Montserrat"/>
                 <w:b/>
                 <w:sz w:val="22"/>
               </w:rPr>
@@ -141,13 +163,16 @@
         </w:tc>
         <w:tc>
           <w:tcPr>
-            <w:tcW w:type="dxa" w:w="2880"/>
+            <w:tcW w:type="dxa" w:w="3408"/>
           </w:tcPr>
           <w:p>
-            <w:r/>
+            <w:pPr>
+              <w:jc w:val="left"/>
+            </w:pPr>
             <w:r>
               <w:rPr>
-                <w:rFonts w:ascii="Montserrat" w:hAnsi="Montserrat"/>
+                <w:rFonts w:ascii="Montserrat" w:hAnsi="Montserrat" w:eastAsia="Montserrat"/>
+                <w:b w:val="0"/>
                 <w:sz w:val="22"/>
               </w:rPr>
               <w:t>Коммуникативные возможности ребёнка</w:t>
@@ -156,13 +181,16 @@
         </w:tc>
         <w:tc>
           <w:tcPr>
-            <w:tcW w:type="dxa" w:w="2880"/>
+            <w:tcW w:type="dxa" w:w="3408"/>
           </w:tcPr>
           <w:p>
-            <w:r/>
+            <w:pPr>
+              <w:jc w:val="left"/>
+            </w:pPr>
             <w:r>
               <w:rPr>
-                <w:rFonts w:ascii="Montserrat" w:hAnsi="Montserrat"/>
+                <w:rFonts w:ascii="Montserrat" w:hAnsi="Montserrat" w:eastAsia="Montserrat"/>
+                <w:b w:val="0"/>
                 <w:sz w:val="22"/>
               </w:rPr>
               <w:t>О. Караневская, О. Бояршинова</w:t>
@@ -173,13 +201,15 @@
       <w:tr>
         <w:tc>
           <w:tcPr>
-            <w:tcW w:type="dxa" w:w="2880"/>
+            <w:tcW w:type="dxa" w:w="3408"/>
           </w:tcPr>
           <w:p>
-            <w:r/>
+            <w:pPr>
+              <w:jc w:val="left"/>
+            </w:pPr>
             <w:r>
               <w:rPr>
-                <w:rFonts w:ascii="Montserrat" w:hAnsi="Montserrat"/>
+                <w:rFonts w:ascii="Montserrat" w:hAnsi="Montserrat" w:eastAsia="Montserrat"/>
                 <w:b/>
                 <w:sz w:val="22"/>
               </w:rPr>
@@ -189,13 +219,16 @@
         </w:tc>
         <w:tc>
           <w:tcPr>
-            <w:tcW w:type="dxa" w:w="2880"/>
+            <w:tcW w:type="dxa" w:w="3408"/>
           </w:tcPr>
           <w:p>
-            <w:r/>
+            <w:pPr>
+              <w:jc w:val="left"/>
+            </w:pPr>
             <w:r>
               <w:rPr>
-                <w:rFonts w:ascii="Montserrat" w:hAnsi="Montserrat"/>
+                <w:rFonts w:ascii="Montserrat" w:hAnsi="Montserrat" w:eastAsia="Montserrat"/>
+                <w:b w:val="0"/>
                 <w:sz w:val="22"/>
               </w:rPr>
               <w:t>Коммуникативные возможности ребёнка</w:t>
@@ -204,13 +237,16 @@
         </w:tc>
         <w:tc>
           <w:tcPr>
-            <w:tcW w:type="dxa" w:w="2880"/>
+            <w:tcW w:type="dxa" w:w="3408"/>
           </w:tcPr>
           <w:p>
-            <w:r/>
+            <w:pPr>
+              <w:jc w:val="left"/>
+            </w:pPr>
             <w:r>
               <w:rPr>
-                <w:rFonts w:ascii="Montserrat" w:hAnsi="Montserrat"/>
+                <w:rFonts w:ascii="Montserrat" w:hAnsi="Montserrat" w:eastAsia="Montserrat"/>
+                <w:b w:val="0"/>
                 <w:sz w:val="22"/>
               </w:rPr>
               <w:t>М. Яремчук, Е. Вальковская</w:t>
@@ -221,13 +257,15 @@
       <w:tr>
         <w:tc>
           <w:tcPr>
-            <w:tcW w:type="dxa" w:w="2880"/>
+            <w:tcW w:type="dxa" w:w="3408"/>
           </w:tcPr>
           <w:p>
-            <w:r/>
+            <w:pPr>
+              <w:jc w:val="left"/>
+            </w:pPr>
             <w:r>
               <w:rPr>
-                <w:rFonts w:ascii="Montserrat" w:hAnsi="Montserrat"/>
+                <w:rFonts w:ascii="Montserrat" w:hAnsi="Montserrat" w:eastAsia="Montserrat"/>
                 <w:b/>
                 <w:sz w:val="22"/>
               </w:rPr>
@@ -237,27 +275,34 @@
         </w:tc>
         <w:tc>
           <w:tcPr>
-            <w:tcW w:type="dxa" w:w="2880"/>
+            <w:tcW w:type="dxa" w:w="3408"/>
           </w:tcPr>
           <w:p>
-            <w:r/>
+            <w:pPr>
+              <w:jc w:val="left"/>
+            </w:pPr>
             <w:r>
               <w:rPr>
-                <w:rFonts w:ascii="Montserrat" w:hAnsi="Montserrat"/>
+                <w:rFonts w:ascii="Montserrat" w:hAnsi="Montserrat" w:eastAsia="Montserrat"/>
+                <w:b w:val="0"/>
                 <w:sz w:val="22"/>
               </w:rPr>
+              <w:t>—</w:t>
             </w:r>
           </w:p>
         </w:tc>
         <w:tc>
           <w:tcPr>
-            <w:tcW w:type="dxa" w:w="2880"/>
+            <w:tcW w:type="dxa" w:w="3408"/>
           </w:tcPr>
           <w:p>
-            <w:r/>
+            <w:pPr>
+              <w:jc w:val="left"/>
+            </w:pPr>
             <w:r>
               <w:rPr>
-                <w:rFonts w:ascii="Montserrat" w:hAnsi="Montserrat"/>
+                <w:rFonts w:ascii="Montserrat" w:hAnsi="Montserrat" w:eastAsia="Montserrat"/>
+                <w:b w:val="0"/>
                 <w:sz w:val="22"/>
               </w:rPr>
               <w:t>Е. Просветова</w:t>
@@ -268,13 +313,15 @@
       <w:tr>
         <w:tc>
           <w:tcPr>
-            <w:tcW w:type="dxa" w:w="2880"/>
+            <w:tcW w:type="dxa" w:w="3408"/>
           </w:tcPr>
           <w:p>
-            <w:r/>
+            <w:pPr>
+              <w:jc w:val="left"/>
+            </w:pPr>
             <w:r>
               <w:rPr>
-                <w:rFonts w:ascii="Montserrat" w:hAnsi="Montserrat"/>
+                <w:rFonts w:ascii="Montserrat" w:hAnsi="Montserrat" w:eastAsia="Montserrat"/>
                 <w:b/>
                 <w:sz w:val="22"/>
               </w:rPr>
@@ -284,13 +331,16 @@
         </w:tc>
         <w:tc>
           <w:tcPr>
-            <w:tcW w:type="dxa" w:w="2880"/>
+            <w:tcW w:type="dxa" w:w="3408"/>
           </w:tcPr>
           <w:p>
-            <w:r/>
+            <w:pPr>
+              <w:jc w:val="left"/>
+            </w:pPr>
             <w:r>
               <w:rPr>
-                <w:rFonts w:ascii="Montserrat" w:hAnsi="Montserrat"/>
+                <w:rFonts w:ascii="Montserrat" w:hAnsi="Montserrat" w:eastAsia="Montserrat"/>
+                <w:b w:val="0"/>
                 <w:sz w:val="22"/>
               </w:rPr>
               <w:t>Бытовые навыки</w:t>
@@ -299,13 +349,16 @@
         </w:tc>
         <w:tc>
           <w:tcPr>
-            <w:tcW w:type="dxa" w:w="2880"/>
+            <w:tcW w:type="dxa" w:w="3408"/>
           </w:tcPr>
           <w:p>
-            <w:r/>
+            <w:pPr>
+              <w:jc w:val="left"/>
+            </w:pPr>
             <w:r>
               <w:rPr>
-                <w:rFonts w:ascii="Montserrat" w:hAnsi="Montserrat"/>
+                <w:rFonts w:ascii="Montserrat" w:hAnsi="Montserrat" w:eastAsia="Montserrat"/>
+                <w:b w:val="0"/>
                 <w:sz w:val="22"/>
               </w:rPr>
               <w:t>Е. Федорова, Н. Мальцева</w:t>
@@ -316,13 +369,15 @@
       <w:tr>
         <w:tc>
           <w:tcPr>
-            <w:tcW w:type="dxa" w:w="2880"/>
+            <w:tcW w:type="dxa" w:w="3408"/>
           </w:tcPr>
           <w:p>
-            <w:r/>
+            <w:pPr>
+              <w:jc w:val="left"/>
+            </w:pPr>
             <w:r>
               <w:rPr>
-                <w:rFonts w:ascii="Montserrat" w:hAnsi="Montserrat"/>
+                <w:rFonts w:ascii="Montserrat" w:hAnsi="Montserrat" w:eastAsia="Montserrat"/>
                 <w:b/>
                 <w:sz w:val="22"/>
               </w:rPr>
@@ -332,13 +387,16 @@
         </w:tc>
         <w:tc>
           <w:tcPr>
-            <w:tcW w:type="dxa" w:w="2880"/>
+            <w:tcW w:type="dxa" w:w="3408"/>
           </w:tcPr>
           <w:p>
-            <w:r/>
+            <w:pPr>
+              <w:jc w:val="left"/>
+            </w:pPr>
             <w:r>
               <w:rPr>
-                <w:rFonts w:ascii="Montserrat" w:hAnsi="Montserrat"/>
+                <w:rFonts w:ascii="Montserrat" w:hAnsi="Montserrat" w:eastAsia="Montserrat"/>
+                <w:b w:val="0"/>
                 <w:sz w:val="22"/>
               </w:rPr>
               <w:t>Готовность к обучению в школе</w:t>
@@ -347,13 +405,16 @@
         </w:tc>
         <w:tc>
           <w:tcPr>
-            <w:tcW w:type="dxa" w:w="2880"/>
+            <w:tcW w:type="dxa" w:w="3408"/>
           </w:tcPr>
           <w:p>
-            <w:r/>
+            <w:pPr>
+              <w:jc w:val="left"/>
+            </w:pPr>
             <w:r>
               <w:rPr>
-                <w:rFonts w:ascii="Montserrat" w:hAnsi="Montserrat"/>
+                <w:rFonts w:ascii="Montserrat" w:hAnsi="Montserrat" w:eastAsia="Montserrat"/>
+                <w:b w:val="0"/>
                 <w:sz w:val="22"/>
               </w:rPr>
               <w:t>Л. Егорова, Т. Бондарь</w:t>
@@ -364,13 +425,15 @@
       <w:tr>
         <w:tc>
           <w:tcPr>
-            <w:tcW w:type="dxa" w:w="2880"/>
+            <w:tcW w:type="dxa" w:w="3408"/>
           </w:tcPr>
           <w:p>
-            <w:r/>
+            <w:pPr>
+              <w:jc w:val="left"/>
+            </w:pPr>
             <w:r>
               <w:rPr>
-                <w:rFonts w:ascii="Montserrat" w:hAnsi="Montserrat"/>
+                <w:rFonts w:ascii="Montserrat" w:hAnsi="Montserrat" w:eastAsia="Montserrat"/>
                 <w:b/>
                 <w:sz w:val="22"/>
               </w:rPr>
@@ -380,13 +443,16 @@
         </w:tc>
         <w:tc>
           <w:tcPr>
-            <w:tcW w:type="dxa" w:w="2880"/>
+            <w:tcW w:type="dxa" w:w="3408"/>
           </w:tcPr>
           <w:p>
-            <w:r/>
+            <w:pPr>
+              <w:jc w:val="left"/>
+            </w:pPr>
             <w:r>
               <w:rPr>
-                <w:rFonts w:ascii="Montserrat" w:hAnsi="Montserrat"/>
+                <w:rFonts w:ascii="Montserrat" w:hAnsi="Montserrat" w:eastAsia="Montserrat"/>
+                <w:b w:val="0"/>
                 <w:sz w:val="22"/>
               </w:rPr>
               <w:t>Проявления СДВГ</w:t>
@@ -395,13 +461,16 @@
         </w:tc>
         <w:tc>
           <w:tcPr>
-            <w:tcW w:type="dxa" w:w="2880"/>
+            <w:tcW w:type="dxa" w:w="3408"/>
           </w:tcPr>
           <w:p>
-            <w:r/>
+            <w:pPr>
+              <w:jc w:val="left"/>
+            </w:pPr>
             <w:r>
               <w:rPr>
-                <w:rFonts w:ascii="Montserrat" w:hAnsi="Montserrat"/>
+                <w:rFonts w:ascii="Montserrat" w:hAnsi="Montserrat" w:eastAsia="Montserrat"/>
+                <w:b w:val="0"/>
                 <w:sz w:val="22"/>
               </w:rPr>
               <w:t>Е. Сафронова, Т. Котляренко</w:t>
@@ -412,13 +481,15 @@
       <w:tr>
         <w:tc>
           <w:tcPr>
-            <w:tcW w:type="dxa" w:w="2880"/>
+            <w:tcW w:type="dxa" w:w="3408"/>
           </w:tcPr>
           <w:p>
-            <w:r/>
+            <w:pPr>
+              <w:jc w:val="left"/>
+            </w:pPr>
             <w:r>
               <w:rPr>
-                <w:rFonts w:ascii="Montserrat" w:hAnsi="Montserrat"/>
+                <w:rFonts w:ascii="Montserrat" w:hAnsi="Montserrat" w:eastAsia="Montserrat"/>
                 <w:b/>
                 <w:sz w:val="22"/>
               </w:rPr>
@@ -428,27 +499,34 @@
         </w:tc>
         <w:tc>
           <w:tcPr>
-            <w:tcW w:type="dxa" w:w="2880"/>
+            <w:tcW w:type="dxa" w:w="3408"/>
           </w:tcPr>
           <w:p>
-            <w:r/>
+            <w:pPr>
+              <w:jc w:val="left"/>
+            </w:pPr>
             <w:r>
               <w:rPr>
-                <w:rFonts w:ascii="Montserrat" w:hAnsi="Montserrat"/>
+                <w:rFonts w:ascii="Montserrat" w:hAnsi="Montserrat" w:eastAsia="Montserrat"/>
+                <w:b w:val="0"/>
                 <w:sz w:val="22"/>
               </w:rPr>
+              <w:t>Сенсорный профиль ребёнка</w:t>
             </w:r>
           </w:p>
         </w:tc>
         <w:tc>
           <w:tcPr>
-            <w:tcW w:type="dxa" w:w="2880"/>
+            <w:tcW w:type="dxa" w:w="3408"/>
           </w:tcPr>
           <w:p>
-            <w:r/>
+            <w:pPr>
+              <w:jc w:val="left"/>
+            </w:pPr>
             <w:r>
               <w:rPr>
-                <w:rFonts w:ascii="Montserrat" w:hAnsi="Montserrat"/>
+                <w:rFonts w:ascii="Montserrat" w:hAnsi="Montserrat" w:eastAsia="Montserrat"/>
+                <w:b w:val="0"/>
                 <w:sz w:val="22"/>
               </w:rPr>
               <w:t>В. Литвинова, О. Семак</w:t>
@@ -459,7 +537,7 @@
     </w:tbl>
     <w:sectPr>
       <w:pgSz w:w="12240" w:h="15840"/>
-      <w:pgMar w:top="1440" w:right="1800" w:bottom="1440" w:left="1800" w:header="720" w:footer="720" w:gutter="0"/>
+      <w:pgMar w:top="1440" w:right="1008" w:bottom="1440" w:left="1008" w:header="720" w:footer="720" w:gutter="0"/>
       <w:cols w:space="720"/>
       <w:docGrid w:linePitch="360"/>
     </w:sectPr>

</xml_diff>